<commit_message>
Corrigir separadores de casas decimais
</commit_message>
<xml_diff>
--- a/Travelling-Salesman-Problem-master/Analises/Relatório Analise.docx
+++ b/Travelling-Salesman-Problem-master/Analises/Relatório Analise.docx
@@ -2369,8 +2369,8 @@
         <w:gridCol w:w="793"/>
         <w:gridCol w:w="906"/>
         <w:gridCol w:w="852"/>
-        <w:gridCol w:w="678"/>
-        <w:gridCol w:w="944"/>
+        <w:gridCol w:w="679"/>
+        <w:gridCol w:w="943"/>
       </w:tblGrid>
       <w:tr>
         <w:trPr>
@@ -2785,7 +2785,7 @@
         </w:tc>
         <w:tc>
           <w:tcPr>
-            <w:tcW w:w="678" w:type="dxa"/>
+            <w:tcW w:w="679" w:type="dxa"/>
             <w:tcBorders>
               <w:bottom w:val="single" w:sz="6" w:space="0" w:color="5E5E5E"/>
             </w:tcBorders>
@@ -2815,7 +2815,7 @@
         </w:tc>
         <w:tc>
           <w:tcPr>
-            <w:tcW w:w="944" w:type="dxa"/>
+            <w:tcW w:w="943" w:type="dxa"/>
             <w:tcBorders>
               <w:bottom w:val="single" w:sz="6" w:space="0" w:color="5E5E5E"/>
             </w:tcBorders>
@@ -3000,7 +3000,7 @@
                 <w:shd w:fill="auto" w:val="clear"/>
                 <w:lang w:val="pt-PT"/>
               </w:rPr>
-              <w:t>0.000154</w:t>
+              <w:t>0,000154</w:t>
             </w:r>
           </w:p>
         </w:tc>
@@ -3060,7 +3060,7 @@
                 <w:shd w:fill="auto" w:val="clear"/>
                 <w:lang w:val="pt-PT"/>
               </w:rPr>
-              <w:t>0.018393</w:t>
+              <w:t>0,018393</w:t>
             </w:r>
           </w:p>
         </w:tc>
@@ -3096,7 +3096,7 @@
         </w:tc>
         <w:tc>
           <w:tcPr>
-            <w:tcW w:w="678" w:type="dxa"/>
+            <w:tcW w:w="679" w:type="dxa"/>
             <w:tcBorders>
               <w:top w:val="single" w:sz="6" w:space="0" w:color="5E5E5E"/>
               <w:bottom w:val="single" w:sz="6" w:space="0" w:color="37383B"/>
@@ -3120,13 +3120,13 @@
                 <w:shd w:fill="auto" w:val="clear"/>
                 <w:lang w:val="pt-PT"/>
               </w:rPr>
-              <w:t>1.0000x</w:t>
+              <w:t>1,00x</w:t>
             </w:r>
           </w:p>
         </w:tc>
         <w:tc>
           <w:tcPr>
-            <w:tcW w:w="944" w:type="dxa"/>
+            <w:tcW w:w="943" w:type="dxa"/>
             <w:tcBorders>
               <w:top w:val="single" w:sz="6" w:space="0" w:color="5E5E5E"/>
               <w:bottom w:val="single" w:sz="6" w:space="0" w:color="37383B"/>
@@ -3150,7 +3150,7 @@
                 <w:shd w:fill="auto" w:val="clear"/>
                 <w:lang w:val="pt-PT"/>
               </w:rPr>
-              <w:t>0.01x mais rápido</w:t>
+              <w:t>0,01x mais rápido</w:t>
             </w:r>
           </w:p>
         </w:tc>
@@ -3308,7 +3308,7 @@
                 <w:shd w:fill="auto" w:val="clear"/>
                 <w:lang w:val="pt-PT"/>
               </w:rPr>
-              <w:t>0.201760</w:t>
+              <w:t>0,201760</w:t>
             </w:r>
           </w:p>
         </w:tc>
@@ -3368,7 +3368,7 @@
                 <w:shd w:fill="auto" w:val="clear"/>
                 <w:lang w:val="pt-PT"/>
               </w:rPr>
-              <w:t>0.111504</w:t>
+              <w:t>0,111504</w:t>
             </w:r>
           </w:p>
         </w:tc>
@@ -3398,13 +3398,13 @@
                 <w:shd w:fill="auto" w:val="clear"/>
                 <w:lang w:val="pt-PT"/>
               </w:rPr>
-              <w:t>6.80% pior</w:t>
+              <w:t>6,80% pior</w:t>
             </w:r>
           </w:p>
         </w:tc>
         <w:tc>
           <w:tcPr>
-            <w:tcW w:w="678" w:type="dxa"/>
+            <w:tcW w:w="679" w:type="dxa"/>
             <w:tcBorders>
               <w:top w:val="single" w:sz="6" w:space="0" w:color="37383B"/>
               <w:bottom w:val="single" w:sz="6" w:space="0" w:color="37383B"/>
@@ -3428,13 +3428,13 @@
                 <w:shd w:fill="auto" w:val="clear"/>
                 <w:lang w:val="pt-PT"/>
               </w:rPr>
-              <w:t>1.0680x</w:t>
+              <w:t>1,07x</w:t>
             </w:r>
           </w:p>
         </w:tc>
         <w:tc>
           <w:tcPr>
-            <w:tcW w:w="944" w:type="dxa"/>
+            <w:tcW w:w="943" w:type="dxa"/>
             <w:tcBorders>
               <w:top w:val="single" w:sz="6" w:space="0" w:color="37383B"/>
               <w:bottom w:val="single" w:sz="6" w:space="0" w:color="37383B"/>
@@ -3458,7 +3458,7 @@
                 <w:shd w:fill="auto" w:val="clear"/>
                 <w:lang w:val="pt-PT"/>
               </w:rPr>
-              <w:t>1.81x mais rápido</w:t>
+              <w:t>1,81x mais rápido</w:t>
             </w:r>
           </w:p>
         </w:tc>
@@ -3616,7 +3616,7 @@
                 <w:shd w:fill="auto" w:val="clear"/>
                 <w:lang w:val="pt-PT"/>
               </w:rPr>
-              <w:t>1.667059</w:t>
+              <w:t>1,667059</w:t>
             </w:r>
           </w:p>
         </w:tc>
@@ -3676,7 +3676,7 @@
                 <w:shd w:fill="auto" w:val="clear"/>
                 <w:lang w:val="pt-PT"/>
               </w:rPr>
-              <w:t>0.012362</w:t>
+              <w:t>0,012362</w:t>
             </w:r>
           </w:p>
         </w:tc>
@@ -3706,13 +3706,13 @@
                 <w:shd w:fill="auto" w:val="clear"/>
                 <w:lang w:val="pt-PT"/>
               </w:rPr>
-              <w:t>13.04% pior</w:t>
+              <w:t>13,04% pior</w:t>
             </w:r>
           </w:p>
         </w:tc>
         <w:tc>
           <w:tcPr>
-            <w:tcW w:w="678" w:type="dxa"/>
+            <w:tcW w:w="679" w:type="dxa"/>
             <w:tcBorders>
               <w:top w:val="single" w:sz="6" w:space="0" w:color="37383B"/>
               <w:bottom w:val="single" w:sz="6" w:space="0" w:color="37383B"/>
@@ -3736,13 +3736,13 @@
                 <w:shd w:fill="auto" w:val="clear"/>
                 <w:lang w:val="pt-PT"/>
               </w:rPr>
-              <w:t>1.1304x</w:t>
+              <w:t>1,13x</w:t>
             </w:r>
           </w:p>
         </w:tc>
         <w:tc>
           <w:tcPr>
-            <w:tcW w:w="944" w:type="dxa"/>
+            <w:tcW w:w="943" w:type="dxa"/>
             <w:tcBorders>
               <w:top w:val="single" w:sz="6" w:space="0" w:color="37383B"/>
               <w:bottom w:val="single" w:sz="6" w:space="0" w:color="37383B"/>
@@ -3766,7 +3766,7 @@
                 <w:shd w:fill="auto" w:val="clear"/>
                 <w:lang w:val="pt-PT"/>
               </w:rPr>
-              <w:t>134.85x mais rápido</w:t>
+              <w:t>134,85x mais rápido</w:t>
             </w:r>
           </w:p>
         </w:tc>
@@ -3924,7 +3924,7 @@
                 <w:shd w:fill="auto" w:val="clear"/>
                 <w:lang w:val="pt-PT"/>
               </w:rPr>
-              <w:t>15.714983</w:t>
+              <w:t>15,714983</w:t>
             </w:r>
           </w:p>
         </w:tc>
@@ -3984,7 +3984,7 @@
                 <w:shd w:fill="auto" w:val="clear"/>
                 <w:lang w:val="pt-PT"/>
               </w:rPr>
-              <w:t>0.011784</w:t>
+              <w:t>0,011784</w:t>
             </w:r>
           </w:p>
         </w:tc>
@@ -4014,13 +4014,13 @@
                 <w:shd w:fill="auto" w:val="clear"/>
                 <w:lang w:val="pt-PT"/>
               </w:rPr>
-              <w:t>24.26% pior</w:t>
+              <w:t>24,26% pior</w:t>
             </w:r>
           </w:p>
         </w:tc>
         <w:tc>
           <w:tcPr>
-            <w:tcW w:w="678" w:type="dxa"/>
+            <w:tcW w:w="679" w:type="dxa"/>
             <w:tcBorders>
               <w:top w:val="single" w:sz="6" w:space="0" w:color="37383B"/>
               <w:bottom w:val="single" w:sz="6" w:space="0" w:color="37383B"/>
@@ -4044,13 +4044,13 @@
                 <w:shd w:fill="auto" w:val="clear"/>
                 <w:lang w:val="pt-PT"/>
               </w:rPr>
-              <w:t>1.2426x</w:t>
+              <w:t>1,24x</w:t>
             </w:r>
           </w:p>
         </w:tc>
         <w:tc>
           <w:tcPr>
-            <w:tcW w:w="944" w:type="dxa"/>
+            <w:tcW w:w="943" w:type="dxa"/>
             <w:tcBorders>
               <w:top w:val="single" w:sz="6" w:space="0" w:color="37383B"/>
               <w:bottom w:val="single" w:sz="6" w:space="0" w:color="37383B"/>
@@ -4074,7 +4074,7 @@
                 <w:shd w:fill="auto" w:val="clear"/>
                 <w:lang w:val="pt-PT"/>
               </w:rPr>
-              <w:t>1.333.58x mais rápido</w:t>
+              <w:t>1.333,58x mais rápido</w:t>
             </w:r>
           </w:p>
         </w:tc>
@@ -4232,7 +4232,7 @@
                 <w:shd w:fill="auto" w:val="clear"/>
                 <w:lang w:val="pt-PT"/>
               </w:rPr>
-              <w:t>368.696655</w:t>
+              <w:t>368,696655</w:t>
             </w:r>
           </w:p>
         </w:tc>
@@ -4292,7 +4292,7 @@
                 <w:shd w:fill="auto" w:val="clear"/>
                 <w:lang w:val="pt-PT"/>
               </w:rPr>
-              <w:t>0.019165</w:t>
+              <w:t>0,019165</w:t>
             </w:r>
           </w:p>
         </w:tc>
@@ -4322,13 +4322,13 @@
                 <w:shd w:fill="auto" w:val="clear"/>
                 <w:lang w:val="pt-PT"/>
               </w:rPr>
-              <w:t>19.29% pior</w:t>
+              <w:t>19,29% pior</w:t>
             </w:r>
           </w:p>
         </w:tc>
         <w:tc>
           <w:tcPr>
-            <w:tcW w:w="678" w:type="dxa"/>
+            <w:tcW w:w="679" w:type="dxa"/>
             <w:tcBorders>
               <w:top w:val="single" w:sz="6" w:space="0" w:color="37383B"/>
               <w:bottom w:val="single" w:sz="6" w:space="0" w:color="37383B"/>
@@ -4352,13 +4352,13 @@
                 <w:shd w:fill="auto" w:val="clear"/>
                 <w:lang w:val="pt-PT"/>
               </w:rPr>
-              <w:t>1.1929x</w:t>
+              <w:t>1,2x</w:t>
             </w:r>
           </w:p>
         </w:tc>
         <w:tc>
           <w:tcPr>
-            <w:tcW w:w="944" w:type="dxa"/>
+            <w:tcW w:w="943" w:type="dxa"/>
             <w:tcBorders>
               <w:top w:val="single" w:sz="6" w:space="0" w:color="37383B"/>
               <w:bottom w:val="single" w:sz="6" w:space="0" w:color="37383B"/>
@@ -4382,7 +4382,7 @@
                 <w:shd w:fill="auto" w:val="clear"/>
                 <w:lang w:val="pt-PT"/>
               </w:rPr>
-              <w:t>19.238.46x mais rápido</w:t>
+              <w:t>19.238,46x mais rápido</w:t>
             </w:r>
           </w:p>
         </w:tc>
@@ -4540,7 +4540,7 @@
                 <w:shd w:fill="auto" w:val="clear"/>
                 <w:lang w:val="pt-PT"/>
               </w:rPr>
-              <w:t>2980.205073</w:t>
+              <w:t>2.980,205073</w:t>
             </w:r>
           </w:p>
         </w:tc>
@@ -4600,7 +4600,7 @@
                 <w:shd w:fill="auto" w:val="clear"/>
                 <w:lang w:val="pt-PT"/>
               </w:rPr>
-              <w:t>0.015631</w:t>
+              <w:t>0,015631</w:t>
             </w:r>
           </w:p>
         </w:tc>
@@ -4630,13 +4630,13 @@
                 <w:shd w:fill="auto" w:val="clear"/>
                 <w:lang w:val="pt-PT"/>
               </w:rPr>
-              <w:t>10.78% pior</w:t>
+              <w:t>10,78% pior</w:t>
             </w:r>
           </w:p>
         </w:tc>
         <w:tc>
           <w:tcPr>
-            <w:tcW w:w="678" w:type="dxa"/>
+            <w:tcW w:w="679" w:type="dxa"/>
             <w:tcBorders>
               <w:top w:val="single" w:sz="6" w:space="0" w:color="37383B"/>
               <w:bottom w:val="single" w:sz="6" w:space="0" w:color="37383B"/>
@@ -4660,13 +4660,13 @@
                 <w:shd w:fill="auto" w:val="clear"/>
                 <w:lang w:val="pt-PT"/>
               </w:rPr>
-              <w:t>1.1078x</w:t>
+              <w:t>1,11x</w:t>
             </w:r>
           </w:p>
         </w:tc>
         <w:tc>
           <w:tcPr>
-            <w:tcW w:w="944" w:type="dxa"/>
+            <w:tcW w:w="943" w:type="dxa"/>
             <w:tcBorders>
               <w:top w:val="single" w:sz="6" w:space="0" w:color="37383B"/>
               <w:bottom w:val="single" w:sz="6" w:space="0" w:color="37383B"/>
@@ -4690,7 +4690,7 @@
                 <w:shd w:fill="auto" w:val="clear"/>
                 <w:lang w:val="pt-PT"/>
               </w:rPr>
-              <w:t>190.654.58x mais rápido</w:t>
+              <w:t>190.654,58x mais rápido</w:t>
             </w:r>
           </w:p>
         </w:tc>
@@ -4911,7 +4911,7 @@
                 <w:shd w:fill="auto" w:val="clear"/>
                 <w:lang w:val="pt-PT"/>
               </w:rPr>
-              <w:t>0.136301</w:t>
+              <w:t>0,136301</w:t>
             </w:r>
           </w:p>
         </w:tc>
@@ -4947,7 +4947,7 @@
         </w:tc>
         <w:tc>
           <w:tcPr>
-            <w:tcW w:w="678" w:type="dxa"/>
+            <w:tcW w:w="679" w:type="dxa"/>
             <w:tcBorders>
               <w:top w:val="single" w:sz="6" w:space="0" w:color="37383B"/>
               <w:bottom w:val="single" w:sz="6" w:space="0" w:color="37383B"/>
@@ -4977,7 +4977,7 @@
         </w:tc>
         <w:tc>
           <w:tcPr>
-            <w:tcW w:w="944" w:type="dxa"/>
+            <w:tcW w:w="943" w:type="dxa"/>
             <w:tcBorders>
               <w:top w:val="single" w:sz="6" w:space="0" w:color="37383B"/>
               <w:bottom w:val="single" w:sz="6" w:space="0" w:color="37383B"/>
@@ -5554,7 +5554,7 @@
         <w:rPr>
           <w:lang w:val="pt-PT"/>
         </w:rPr>
-        <w:t>timo, ou razão de 1.2426x), demonstrando uma perda de qualidade considerada pequena diante do enorme ganho de velocidade.</w:t>
+        <w:t>timo, ou razão de 1,2426x), demonstrando uma perda de qualidade considerada pequena diante do enorme ganho de velocidade.</w:t>
       </w:r>
     </w:p>
     <w:p>
@@ -5737,7 +5737,7 @@
         <w:rPr>
           <w:lang w:val="pt-PT"/>
         </w:rPr>
-        <w:t>com o primeiro saltando de 688,47 para 2843,17 e o segundo de 596,28 para 2568,42 no intervalo de 50 a 1000 cidades. Em contrapartida, o algoritmo de aproximaçã</w:t>
+        <w:t>com o primeiro saltando de 688,47 para 2.843,17 e o segundo de 596,28 para 2.568,42 no intervalo de 50 a 1000 cidades. Em contrapartida, o algoritmo de aproximaçã</w:t>
       </w:r>
       <w:r>
         <w:rPr>

</xml_diff>